<commit_message>
agregue la calse del punto 2 sin ejecutable
</commit_message>
<xml_diff>
--- a/POO/practica/tp1bluej/informe tp2.docx
+++ b/POO/practica/tp1bluej/informe tp2.docx
@@ -38,7 +38,16 @@
           <w:sz w:val="20"/>
           <w:szCs w:val="20"/>
         </w:rPr>
-        <w:t>Nombre Profesor:</w:t>
+        <w:t xml:space="preserve">Nombre </w:t>
+      </w:r>
+      <w:proofErr w:type="spellStart"/>
+      <w:r>
+        <w:rPr>
+          <w:rFonts w:ascii="Arial" w:hAnsi="Arial" w:cs="Arial"/>
+          <w:sz w:val="20"/>
+          <w:szCs w:val="20"/>
+        </w:rPr>
+        <w:t>Profesor:</w:t>
       </w:r>
       <w:r>
         <w:rPr>
@@ -48,7 +57,18 @@
           <w:sz w:val="20"/>
           <w:szCs w:val="20"/>
         </w:rPr>
-        <w:t>Yanina Medina – Andrea Lezcano Airaldi - Matías Mascazzini</w:t>
+        <w:t>Yanina</w:t>
+      </w:r>
+      <w:proofErr w:type="spellEnd"/>
+      <w:r>
+        <w:rPr>
+          <w:rFonts w:ascii="Arial" w:hAnsi="Arial" w:cs="Arial"/>
+          <w:b/>
+          <w:bCs/>
+          <w:sz w:val="20"/>
+          <w:szCs w:val="20"/>
+        </w:rPr>
+        <w:t> Medina – Andrea Lezcano Airaldi - Matías Mascazzini</w:t>
       </w:r>
     </w:p>
     <w:p>
@@ -102,25 +122,73 @@
           <w:sz w:val="20"/>
           <w:szCs w:val="20"/>
         </w:rPr>
-        <w:t>TP: Trabajo Practico N°2.</w:t>
-      </w:r>
-    </w:p>
-    <w:p>
-      <w:pPr>
-        <w:spacing w:after="0" w:line="240" w:lineRule="auto"/>
-        <w:rPr>
-          <w:rFonts w:ascii="Arial" w:hAnsi="Arial" w:cs="Arial"/>
-          <w:sz w:val="20"/>
-          <w:szCs w:val="20"/>
-        </w:rPr>
-      </w:pPr>
-      <w:r>
-        <w:rPr>
-          <w:rFonts w:ascii="Arial" w:hAnsi="Arial" w:cs="Arial"/>
-          <w:sz w:val="20"/>
-          <w:szCs w:val="20"/>
-        </w:rPr>
-        <w:t>Fecha de Entrega: Domingo 23/08/26.</w:t>
+        <w:t>TP: Trabajo Practico N°</w:t>
+      </w:r>
+      <w:r>
+        <w:rPr>
+          <w:rFonts w:ascii="Arial" w:hAnsi="Arial" w:cs="Arial"/>
+          <w:sz w:val="20"/>
+          <w:szCs w:val="20"/>
+        </w:rPr>
+        <w:t>4</w:t>
+      </w:r>
+      <w:r>
+        <w:rPr>
+          <w:rFonts w:ascii="Arial" w:hAnsi="Arial" w:cs="Arial"/>
+          <w:sz w:val="20"/>
+          <w:szCs w:val="20"/>
+        </w:rPr>
+        <w:t>.</w:t>
+      </w:r>
+    </w:p>
+    <w:p>
+      <w:pPr>
+        <w:spacing w:after="0" w:line="240" w:lineRule="auto"/>
+        <w:rPr>
+          <w:rFonts w:ascii="Arial" w:hAnsi="Arial" w:cs="Arial"/>
+          <w:sz w:val="20"/>
+          <w:szCs w:val="20"/>
+        </w:rPr>
+      </w:pPr>
+      <w:r>
+        <w:rPr>
+          <w:rFonts w:ascii="Arial" w:hAnsi="Arial" w:cs="Arial"/>
+          <w:sz w:val="20"/>
+          <w:szCs w:val="20"/>
+        </w:rPr>
+        <w:t>Fecha de Entrega: Domingo 2</w:t>
+      </w:r>
+      <w:r>
+        <w:rPr>
+          <w:rFonts w:ascii="Arial" w:hAnsi="Arial" w:cs="Arial"/>
+          <w:sz w:val="20"/>
+          <w:szCs w:val="20"/>
+        </w:rPr>
+        <w:t>0</w:t>
+      </w:r>
+      <w:r>
+        <w:rPr>
+          <w:rFonts w:ascii="Arial" w:hAnsi="Arial" w:cs="Arial"/>
+          <w:sz w:val="20"/>
+          <w:szCs w:val="20"/>
+        </w:rPr>
+        <w:t>/0</w:t>
+      </w:r>
+      <w:r>
+        <w:rPr>
+          <w:rFonts w:ascii="Arial" w:hAnsi="Arial" w:cs="Arial"/>
+          <w:sz w:val="20"/>
+          <w:szCs w:val="20"/>
+        </w:rPr>
+        <w:t>9</w:t>
+      </w:r>
+      <w:r>
+        <w:rPr>
+          <w:rFonts w:ascii="Arial" w:hAnsi="Arial" w:cs="Arial"/>
+          <w:sz w:val="20"/>
+          <w:szCs w:val="20"/>
+        </w:rPr>
+        <w:t>/26.</w:t>
       </w:r>
     </w:p>
     <w:p>
@@ -156,6 +224,34 @@
           <w:sz w:val="20"/>
           <w:szCs w:val="20"/>
         </w:rPr>
+        <w:t xml:space="preserve">Tema: Colecciones de objetos estáticas y </w:t>
+      </w:r>
+      <w:proofErr w:type="spellStart"/>
+      <w:r>
+        <w:rPr>
+          <w:rFonts w:ascii="Arial" w:hAnsi="Arial" w:cs="Arial"/>
+          <w:sz w:val="20"/>
+          <w:szCs w:val="20"/>
+        </w:rPr>
+        <w:t>dinamicas</w:t>
+      </w:r>
+      <w:proofErr w:type="spellEnd"/>
+    </w:p>
+    <w:p>
+      <w:pPr>
+        <w:spacing w:after="0" w:line="240" w:lineRule="auto"/>
+        <w:rPr>
+          <w:rFonts w:ascii="Arial" w:hAnsi="Arial" w:cs="Arial"/>
+          <w:sz w:val="20"/>
+          <w:szCs w:val="20"/>
+        </w:rPr>
+      </w:pPr>
+      <w:r>
+        <w:rPr>
+          <w:rFonts w:ascii="Arial" w:hAnsi="Arial" w:cs="Arial"/>
+          <w:sz w:val="20"/>
+          <w:szCs w:val="20"/>
+        </w:rPr>
         <w:t>1)Introducción y objetivos:</w:t>
       </w:r>
     </w:p>
@@ -175,24 +271,137 @@
           <w:szCs w:val="20"/>
         </w:rPr>
         <w:tab/>
-        <w:t xml:space="preserve">El presente informe tiene como propósito fundamentar la aplicación de los   conceptos teóricas del paradigma Orientado a Objetos desarrollados durante la resolución de la serie de ejercicios del TP N°2 a lo largo de la práctica se buscó aplicar los </w:t>
-      </w:r>
-      <w:r>
-        <w:rPr>
-          <w:rFonts w:ascii="Arial" w:hAnsi="Arial" w:cs="Arial"/>
-          <w:sz w:val="20"/>
-          <w:szCs w:val="20"/>
-        </w:rPr>
-        <w:t>conceptos abstrayendo</w:t>
-      </w:r>
-      <w:r>
-        <w:rPr>
-          <w:rFonts w:ascii="Arial" w:hAnsi="Arial" w:cs="Arial"/>
-          <w:sz w:val="20"/>
-          <w:szCs w:val="20"/>
-        </w:rPr>
-        <w:t xml:space="preserve"> entidades del mundo real, modelando sus estados y comportamientos y garantizar un diseño de código mantenible, seguro y reutilizable.</w:t>
-      </w:r>
+      </w:r>
+      <w:r>
+        <w:rPr>
+          <w:rFonts w:ascii="Arial" w:hAnsi="Arial" w:cs="Arial"/>
+          <w:sz w:val="20"/>
+          <w:szCs w:val="20"/>
+        </w:rPr>
+        <w:t>El presente trabajo práctico aborda la transición del manejo de objetos individuales al trabajo con agrupaciones o conjuntos de elementos en Java. En el desarrollo de software real, es indispensable gestionar listas de datos que puedan crecer, achicarse o filtrarse según las necesidades de la aplicación.</w:t>
+      </w:r>
+    </w:p>
+    <w:p>
+      <w:pPr>
+        <w:spacing w:after="0" w:line="240" w:lineRule="auto"/>
+        <w:rPr>
+          <w:rFonts w:ascii="Arial" w:hAnsi="Arial" w:cs="Arial"/>
+          <w:sz w:val="20"/>
+          <w:szCs w:val="20"/>
+        </w:rPr>
+      </w:pPr>
+      <w:r>
+        <w:rPr>
+          <w:rFonts w:ascii="Arial" w:hAnsi="Arial" w:cs="Arial"/>
+          <w:sz w:val="20"/>
+          <w:szCs w:val="20"/>
+        </w:rPr>
+        <w:t xml:space="preserve">A lo largo de este práctico se busca aprender a seleccionar la estructura de datos adecuada para cada escenario. Se analizan desde contenedores de tamaño fijo (arreglos) hasta las principales colecciones dinámicas del </w:t>
+      </w:r>
+      <w:r>
+        <w:rPr>
+          <w:rFonts w:ascii="Arial" w:hAnsi="Arial" w:cs="Arial"/>
+          <w:i/>
+          <w:iCs/>
+          <w:sz w:val="20"/>
+          <w:szCs w:val="20"/>
+        </w:rPr>
+        <w:t xml:space="preserve">Java </w:t>
+      </w:r>
+      <w:proofErr w:type="spellStart"/>
+      <w:r>
+        <w:rPr>
+          <w:rFonts w:ascii="Arial" w:hAnsi="Arial" w:cs="Arial"/>
+          <w:i/>
+          <w:iCs/>
+          <w:sz w:val="20"/>
+          <w:szCs w:val="20"/>
+        </w:rPr>
+        <w:t>Collections</w:t>
+      </w:r>
+      <w:proofErr w:type="spellEnd"/>
+      <w:r>
+        <w:rPr>
+          <w:rFonts w:ascii="Arial" w:hAnsi="Arial" w:cs="Arial"/>
+          <w:i/>
+          <w:iCs/>
+          <w:sz w:val="20"/>
+          <w:szCs w:val="20"/>
+        </w:rPr>
+        <w:t xml:space="preserve"> Framework</w:t>
+      </w:r>
+      <w:r>
+        <w:rPr>
+          <w:rFonts w:ascii="Arial" w:hAnsi="Arial" w:cs="Arial"/>
+          <w:sz w:val="20"/>
+          <w:szCs w:val="20"/>
+        </w:rPr>
+        <w:t xml:space="preserve"> (</w:t>
+      </w:r>
+      <w:proofErr w:type="spellStart"/>
+      <w:r>
+        <w:rPr>
+          <w:rFonts w:ascii="Arial" w:hAnsi="Arial" w:cs="Arial"/>
+          <w:sz w:val="20"/>
+          <w:szCs w:val="20"/>
+        </w:rPr>
+        <w:t>ArrayList</w:t>
+      </w:r>
+      <w:proofErr w:type="spellEnd"/>
+      <w:r>
+        <w:rPr>
+          <w:rFonts w:ascii="Arial" w:hAnsi="Arial" w:cs="Arial"/>
+          <w:sz w:val="20"/>
+          <w:szCs w:val="20"/>
+        </w:rPr>
+        <w:t xml:space="preserve">, </w:t>
+      </w:r>
+      <w:proofErr w:type="spellStart"/>
+      <w:r>
+        <w:rPr>
+          <w:rFonts w:ascii="Arial" w:hAnsi="Arial" w:cs="Arial"/>
+          <w:sz w:val="20"/>
+          <w:szCs w:val="20"/>
+        </w:rPr>
+        <w:t>HashSet</w:t>
+      </w:r>
+      <w:proofErr w:type="spellEnd"/>
+      <w:r>
+        <w:rPr>
+          <w:rFonts w:ascii="Arial" w:hAnsi="Arial" w:cs="Arial"/>
+          <w:sz w:val="20"/>
+          <w:szCs w:val="20"/>
+        </w:rPr>
+        <w:t xml:space="preserve"> y </w:t>
+      </w:r>
+      <w:proofErr w:type="spellStart"/>
+      <w:r>
+        <w:rPr>
+          <w:rFonts w:ascii="Arial" w:hAnsi="Arial" w:cs="Arial"/>
+          <w:sz w:val="20"/>
+          <w:szCs w:val="20"/>
+        </w:rPr>
+        <w:t>HashMap</w:t>
+      </w:r>
+      <w:proofErr w:type="spellEnd"/>
+      <w:r>
+        <w:rPr>
+          <w:rFonts w:ascii="Arial" w:hAnsi="Arial" w:cs="Arial"/>
+          <w:sz w:val="20"/>
+          <w:szCs w:val="20"/>
+        </w:rPr>
+        <w:t>). Asimismo, el práctico exige aplicar la reutilización de clases modeladas previamente (Punto, Producto, Cliente, Empleado, Persona, Localidad), reforzando el concepto de modularidad en la programación orientada a objetos</w:t>
+      </w:r>
+    </w:p>
+    <w:p>
+      <w:pPr>
+        <w:spacing w:after="0" w:line="240" w:lineRule="auto"/>
+        <w:rPr>
+          <w:rFonts w:ascii="Arial" w:hAnsi="Arial" w:cs="Arial"/>
+          <w:sz w:val="20"/>
+          <w:szCs w:val="20"/>
+        </w:rPr>
+      </w:pPr>
     </w:p>
     <w:p>
       <w:pPr>
@@ -228,137 +437,160 @@
           <w:szCs w:val="20"/>
         </w:rPr>
         <w:tab/>
-        <w:t>-</w:t>
-      </w:r>
-      <w:r>
-        <w:rPr>
-          <w:rFonts w:ascii="Arial" w:hAnsi="Arial" w:cs="Arial"/>
-          <w:sz w:val="20"/>
-          <w:szCs w:val="20"/>
-        </w:rPr>
-        <w:t>Abstracción:</w:t>
-      </w:r>
-      <w:r>
-        <w:rPr>
-          <w:rFonts w:ascii="Arial" w:hAnsi="Arial" w:cs="Arial"/>
-          <w:sz w:val="20"/>
-          <w:szCs w:val="20"/>
-        </w:rPr>
-        <w:t xml:space="preserve"> Consiste en identificar las </w:t>
-      </w:r>
-      <w:r>
-        <w:rPr>
-          <w:rFonts w:ascii="Arial" w:hAnsi="Arial" w:cs="Arial"/>
-          <w:sz w:val="20"/>
-          <w:szCs w:val="20"/>
-        </w:rPr>
-        <w:t>características</w:t>
-      </w:r>
-      <w:r>
-        <w:rPr>
-          <w:rFonts w:ascii="Arial" w:hAnsi="Arial" w:cs="Arial"/>
-          <w:sz w:val="20"/>
-          <w:szCs w:val="20"/>
-        </w:rPr>
-        <w:t xml:space="preserve"> y </w:t>
-      </w:r>
-      <w:r>
-        <w:rPr>
-          <w:rFonts w:ascii="Arial" w:hAnsi="Arial" w:cs="Arial"/>
-          <w:sz w:val="20"/>
-          <w:szCs w:val="20"/>
-        </w:rPr>
-        <w:t>comportamientos</w:t>
-      </w:r>
-      <w:r>
-        <w:rPr>
-          <w:rFonts w:ascii="Arial" w:hAnsi="Arial" w:cs="Arial"/>
-          <w:sz w:val="20"/>
-          <w:szCs w:val="20"/>
-        </w:rPr>
-        <w:t xml:space="preserve"> esenciales de un objetivo del mundo real, descartando los detalles irrelevantes para el problema a resolver. En el ejercicio de la clase “Persona”</w:t>
-      </w:r>
-      <w:r>
-        <w:rPr>
-          <w:rFonts w:ascii="Arial" w:hAnsi="Arial" w:cs="Arial"/>
-          <w:sz w:val="20"/>
-          <w:szCs w:val="20"/>
-        </w:rPr>
-        <w:t>, se abstrajeron únicamente las propiedades necesarias para la gestión de datos Básicos y el calculo de la edad ( nrodni, nombre, apellido, anioNacimiento) , dejando de lado otros atributos no necesarios como la dirección teléfono o redes sociales etc.</w:t>
-      </w:r>
-    </w:p>
-    <w:p>
-      <w:pPr>
-        <w:spacing w:after="0" w:line="240" w:lineRule="auto"/>
-        <w:rPr>
-          <w:rFonts w:ascii="Arial" w:hAnsi="Arial" w:cs="Arial"/>
-          <w:sz w:val="20"/>
-          <w:szCs w:val="20"/>
-        </w:rPr>
-      </w:pPr>
-      <w:r>
-        <w:rPr>
-          <w:rFonts w:ascii="Arial" w:hAnsi="Arial" w:cs="Arial"/>
-          <w:sz w:val="20"/>
-          <w:szCs w:val="20"/>
-        </w:rPr>
-        <w:tab/>
-        <w:t xml:space="preserve">- Encapsulamiento y ocultamiento de la información : Es el principio </w:t>
-      </w:r>
-      <w:r>
-        <w:rPr>
-          <w:rFonts w:ascii="Arial" w:hAnsi="Arial" w:cs="Arial"/>
-          <w:sz w:val="20"/>
-          <w:szCs w:val="20"/>
-        </w:rPr>
-        <w:t>mediante</w:t>
-      </w:r>
-      <w:r>
-        <w:rPr>
-          <w:rFonts w:ascii="Arial" w:hAnsi="Arial" w:cs="Arial"/>
-          <w:sz w:val="20"/>
-          <w:szCs w:val="20"/>
-        </w:rPr>
-        <w:t xml:space="preserve"> el cual se restringe el acceso directo al estado interno de un objeto , protegiéndolo de modificaciones indebidas desde el exterior. Esto se logra definiendo los atributos de las clases modelo con el modificador de </w:t>
-      </w:r>
-      <w:r>
-        <w:rPr>
-          <w:rFonts w:ascii="Arial" w:hAnsi="Arial" w:cs="Arial"/>
-          <w:sz w:val="20"/>
-          <w:szCs w:val="20"/>
-        </w:rPr>
-        <w:t>visibilidad</w:t>
-      </w:r>
-      <w:r>
-        <w:rPr>
-          <w:rFonts w:ascii="Arial" w:hAnsi="Arial" w:cs="Arial"/>
-          <w:sz w:val="20"/>
-          <w:szCs w:val="20"/>
-        </w:rPr>
-        <w:t xml:space="preserve"> “private”. Por ejemplo , en la clase Empleado , el atributo “ sueldoBasico ”es privada , impidiendo que en una clase externa altere directamente su monto sin pasar por la lógica del sistema .</w:t>
-      </w:r>
-    </w:p>
-    <w:p>
-      <w:pPr>
-        <w:spacing w:after="0" w:line="240" w:lineRule="auto"/>
-        <w:rPr>
-          <w:rFonts w:ascii="Arial" w:hAnsi="Arial" w:cs="Arial"/>
-          <w:sz w:val="20"/>
-          <w:szCs w:val="20"/>
-        </w:rPr>
-      </w:pPr>
-      <w:r>
-        <w:rPr>
-          <w:rFonts w:ascii="Arial" w:hAnsi="Arial" w:cs="Arial"/>
+      </w:r>
+      <w:r>
+        <w:rPr>
+          <w:rFonts w:ascii="Arial" w:hAnsi="Arial" w:cs="Arial"/>
+          <w:sz w:val="20"/>
+          <w:szCs w:val="20"/>
+        </w:rPr>
+        <w:t xml:space="preserve">Para el primer </w:t>
+      </w:r>
+      <w:proofErr w:type="spellStart"/>
+      <w:r>
+        <w:rPr>
+          <w:rFonts w:ascii="Arial" w:hAnsi="Arial" w:cs="Arial"/>
+          <w:sz w:val="20"/>
+          <w:szCs w:val="20"/>
+        </w:rPr>
+        <w:t>ejecicio</w:t>
+      </w:r>
+      <w:proofErr w:type="spellEnd"/>
+      <w:r>
+        <w:rPr>
+          <w:rFonts w:ascii="Arial" w:hAnsi="Arial" w:cs="Arial"/>
+          <w:sz w:val="20"/>
+          <w:szCs w:val="20"/>
+        </w:rPr>
+        <w:t xml:space="preserve"> (Array de Puntos)</w:t>
+      </w:r>
+      <w:r>
+        <w:rPr>
+          <w:rFonts w:ascii="Arial" w:hAnsi="Arial" w:cs="Arial"/>
+          <w:sz w:val="20"/>
+          <w:szCs w:val="20"/>
+        </w:rPr>
+        <w:t xml:space="preserve"> se </w:t>
+      </w:r>
+      <w:proofErr w:type="spellStart"/>
+      <w:r>
+        <w:rPr>
+          <w:rFonts w:ascii="Arial" w:hAnsi="Arial" w:cs="Arial"/>
+          <w:sz w:val="20"/>
+          <w:szCs w:val="20"/>
+        </w:rPr>
+        <w:t>implemento</w:t>
+      </w:r>
+      <w:proofErr w:type="spellEnd"/>
+      <w:r>
+        <w:rPr>
+          <w:rFonts w:ascii="Arial" w:hAnsi="Arial" w:cs="Arial"/>
+          <w:sz w:val="20"/>
+          <w:szCs w:val="20"/>
+        </w:rPr>
+        <w:t xml:space="preserve"> una  colección (o contenedor) de tipo </w:t>
+      </w:r>
+      <w:proofErr w:type="spellStart"/>
+      <w:r>
+        <w:rPr>
+          <w:rFonts w:ascii="Arial" w:hAnsi="Arial" w:cs="Arial"/>
+          <w:sz w:val="20"/>
+          <w:szCs w:val="20"/>
+        </w:rPr>
+        <w:t>estatico</w:t>
+      </w:r>
+      <w:proofErr w:type="spellEnd"/>
+      <w:r>
+        <w:rPr>
+          <w:rFonts w:ascii="Arial" w:hAnsi="Arial" w:cs="Arial"/>
+          <w:sz w:val="20"/>
+          <w:szCs w:val="20"/>
+        </w:rPr>
+        <w:t xml:space="preserve"> y homogénea</w:t>
+      </w:r>
+    </w:p>
+    <w:p>
+      <w:pPr>
+        <w:spacing w:after="0" w:line="240" w:lineRule="auto"/>
+        <w:rPr>
+          <w:rFonts w:ascii="Arial" w:hAnsi="Arial" w:cs="Arial"/>
+          <w:sz w:val="20"/>
+          <w:szCs w:val="20"/>
+        </w:rPr>
+      </w:pPr>
+      <w:r>
+        <w:rPr>
+          <w:rFonts w:ascii="Arial" w:hAnsi="Arial" w:cs="Arial"/>
+          <w:sz w:val="20"/>
+          <w:szCs w:val="20"/>
+        </w:rPr>
+        <w:t xml:space="preserve">Mas precisamente un contenedor de tipo Punto con espacio para objetos de tipo punto es decir contenedor </w:t>
+      </w:r>
+      <w:proofErr w:type="spellStart"/>
+      <w:r>
+        <w:rPr>
+          <w:rFonts w:ascii="Arial" w:hAnsi="Arial" w:cs="Arial"/>
+          <w:sz w:val="20"/>
+          <w:szCs w:val="20"/>
+        </w:rPr>
+        <w:t>homogeneo</w:t>
+      </w:r>
+      <w:proofErr w:type="spellEnd"/>
+      <w:r>
+        <w:rPr>
+          <w:rFonts w:ascii="Arial" w:hAnsi="Arial" w:cs="Arial"/>
+          <w:sz w:val="20"/>
+          <w:szCs w:val="20"/>
+        </w:rPr>
+        <w:t xml:space="preserve"> de tipo </w:t>
+      </w:r>
+      <w:proofErr w:type="spellStart"/>
+      <w:r>
+        <w:rPr>
+          <w:rFonts w:ascii="Arial" w:hAnsi="Arial" w:cs="Arial"/>
+          <w:sz w:val="20"/>
+          <w:szCs w:val="20"/>
+        </w:rPr>
+        <w:t>estatico</w:t>
+      </w:r>
+      <w:proofErr w:type="spellEnd"/>
+      <w:r>
+        <w:rPr>
+          <w:rFonts w:ascii="Arial" w:hAnsi="Arial" w:cs="Arial"/>
+          <w:sz w:val="20"/>
+          <w:szCs w:val="20"/>
+        </w:rPr>
+        <w:t>.</w:t>
+      </w:r>
+    </w:p>
+    <w:p>
+      <w:pPr>
+        <w:spacing w:after="0" w:line="240" w:lineRule="auto"/>
+        <w:rPr>
+          <w:rFonts w:ascii="Arial" w:hAnsi="Arial" w:cs="Arial"/>
+          <w:sz w:val="20"/>
+          <w:szCs w:val="20"/>
+        </w:rPr>
+      </w:pPr>
+    </w:p>
+    <w:p>
+      <w:pPr>
+        <w:spacing w:after="0" w:line="240" w:lineRule="auto"/>
+        <w:rPr>
+          <w:rFonts w:ascii="Arial" w:hAnsi="Arial" w:cs="Arial"/>
+          <w:sz w:val="20"/>
+          <w:szCs w:val="20"/>
+        </w:rPr>
+      </w:pPr>
+      <w:r>
+        <w:rPr>
           <w:noProof/>
-          <w:sz w:val="20"/>
-          <w:szCs w:val="20"/>
         </w:rPr>
         <w:drawing>
-          <wp:inline distT="0" distB="0" distL="0" distR="0" wp14:anchorId="26BE8C26" wp14:editId="164586F5">
-            <wp:extent cx="5400040" cy="809625"/>
-            <wp:effectExtent l="0" t="0" r="0" b="9525"/>
-            <wp:docPr id="961219533" name="Imagen 1"/>
+          <wp:inline distT="0" distB="0" distL="0" distR="0" wp14:anchorId="48ACB6FE" wp14:editId="24F4FC6D">
+            <wp:extent cx="5495925" cy="457200"/>
+            <wp:effectExtent l="0" t="0" r="9525" b="0"/>
+            <wp:docPr id="1815730045" name="Imagen 1"/>
             <wp:cNvGraphicFramePr>
               <a:graphicFrameLocks xmlns:a="http://schemas.openxmlformats.org/drawingml/2006/main" noChangeAspect="1"/>
             </wp:cNvGraphicFramePr>
@@ -366,7 +598,7 @@
               <a:graphicData uri="http://schemas.openxmlformats.org/drawingml/2006/picture">
                 <pic:pic xmlns:pic="http://schemas.openxmlformats.org/drawingml/2006/picture">
                   <pic:nvPicPr>
-                    <pic:cNvPr id="961219533" name=""/>
+                    <pic:cNvPr id="1815730045" name=""/>
                     <pic:cNvPicPr/>
                   </pic:nvPicPr>
                   <pic:blipFill>
@@ -378,7 +610,7 @@
                   <pic:spPr>
                     <a:xfrm>
                       <a:off x="0" y="0"/>
-                      <a:ext cx="5400040" cy="809625"/>
+                      <a:ext cx="5495925" cy="457200"/>
                     </a:xfrm>
                     <a:prstGeom prst="rect">
                       <a:avLst/>
@@ -407,71 +639,44 @@
           <w:szCs w:val="20"/>
         </w:rPr>
         <w:tab/>
-        <w:t xml:space="preserve">-Doble Encapsulamiento y la Autorreferencia this: Esta técnica extiende el encapsulamiento al ámbito </w:t>
-      </w:r>
-      <w:r>
-        <w:rPr>
-          <w:rFonts w:ascii="Arial" w:hAnsi="Arial" w:cs="Arial"/>
-          <w:sz w:val="20"/>
-          <w:szCs w:val="20"/>
-        </w:rPr>
-        <w:t>interno</w:t>
-      </w:r>
-      <w:r>
-        <w:rPr>
-          <w:rFonts w:ascii="Arial" w:hAnsi="Arial" w:cs="Arial"/>
-          <w:sz w:val="20"/>
-          <w:szCs w:val="20"/>
-        </w:rPr>
-        <w:t xml:space="preserve"> de la propia clase , forzando a que los métodos de la entidad no accedan de </w:t>
-      </w:r>
-      <w:r>
-        <w:rPr>
-          <w:rFonts w:ascii="Arial" w:hAnsi="Arial" w:cs="Arial"/>
-          <w:sz w:val="20"/>
-          <w:szCs w:val="20"/>
-        </w:rPr>
-        <w:t>forma</w:t>
-      </w:r>
-      <w:r>
-        <w:rPr>
-          <w:rFonts w:ascii="Arial" w:hAnsi="Arial" w:cs="Arial"/>
-          <w:sz w:val="20"/>
-          <w:szCs w:val="20"/>
-        </w:rPr>
-        <w:t xml:space="preserve"> directa a las variables de instancia , sino a través de sus correspondientes métodos mutadores ( Setters) y observadores(geetters) . En el método edad() de la case persona , en lugar de operar directamente con el atributo anioNacimiento , se invoca la función observadora this.getAnioNacimiento() la palabra reservada this actúa como una referencia </w:t>
-      </w:r>
-      <w:r>
-        <w:rPr>
-          <w:rFonts w:ascii="Arial" w:hAnsi="Arial" w:cs="Arial"/>
-          <w:sz w:val="20"/>
-          <w:szCs w:val="20"/>
-        </w:rPr>
-        <w:t>explica</w:t>
-      </w:r>
-      <w:r>
-        <w:rPr>
-          <w:rFonts w:ascii="Arial" w:hAnsi="Arial" w:cs="Arial"/>
-          <w:sz w:val="20"/>
-          <w:szCs w:val="20"/>
-        </w:rPr>
-        <w:t xml:space="preserve"> al objeto actual que </w:t>
-      </w:r>
-      <w:r>
-        <w:rPr>
-          <w:rFonts w:ascii="Arial" w:hAnsi="Arial" w:cs="Arial"/>
-          <w:sz w:val="20"/>
-          <w:szCs w:val="20"/>
-        </w:rPr>
-        <w:t>ejecuta</w:t>
-      </w:r>
-      <w:r>
-        <w:rPr>
-          <w:rFonts w:ascii="Arial" w:hAnsi="Arial" w:cs="Arial"/>
-          <w:sz w:val="20"/>
-          <w:szCs w:val="20"/>
-        </w:rPr>
-        <w:t xml:space="preserve"> el mensaje.</w:t>
+      </w:r>
+    </w:p>
+    <w:p>
+      <w:pPr>
+        <w:spacing w:after="0" w:line="240" w:lineRule="auto"/>
+        <w:rPr>
+          <w:rFonts w:ascii="Arial" w:hAnsi="Arial" w:cs="Arial"/>
+          <w:sz w:val="20"/>
+          <w:szCs w:val="20"/>
+        </w:rPr>
+      </w:pPr>
+    </w:p>
+    <w:p>
+      <w:pPr>
+        <w:spacing w:after="0" w:line="240" w:lineRule="auto"/>
+        <w:rPr>
+          <w:rFonts w:ascii="Arial" w:hAnsi="Arial" w:cs="Arial"/>
+          <w:sz w:val="20"/>
+          <w:szCs w:val="20"/>
+        </w:rPr>
+      </w:pPr>
+    </w:p>
+    <w:p>
+      <w:pPr>
+        <w:spacing w:after="0" w:line="240" w:lineRule="auto"/>
+        <w:rPr>
+          <w:rFonts w:ascii="Arial" w:hAnsi="Arial" w:cs="Arial"/>
+          <w:sz w:val="20"/>
+          <w:szCs w:val="20"/>
+        </w:rPr>
+      </w:pPr>
+      <w:r>
+        <w:rPr>
+          <w:rFonts w:ascii="Arial" w:hAnsi="Arial" w:cs="Arial"/>
+          <w:sz w:val="20"/>
+          <w:szCs w:val="20"/>
+        </w:rPr>
+        <w:t>.</w:t>
       </w:r>
     </w:p>
     <w:p>
@@ -591,7 +796,43 @@
           <w:sz w:val="20"/>
           <w:szCs w:val="20"/>
         </w:rPr>
-        <w:t xml:space="preserve"> en el origen(0,0) y el otro explicito punto (p_x ,p_Y), que sitúa el objeto en coordenadas </w:t>
+        <w:t xml:space="preserve"> en el origen(0,0) y el otro explicito punto (</w:t>
+      </w:r>
+      <w:proofErr w:type="spellStart"/>
+      <w:r>
+        <w:rPr>
+          <w:rFonts w:ascii="Arial" w:hAnsi="Arial" w:cs="Arial"/>
+          <w:sz w:val="20"/>
+          <w:szCs w:val="20"/>
+        </w:rPr>
+        <w:t>p_x</w:t>
+      </w:r>
+      <w:proofErr w:type="spellEnd"/>
+      <w:r>
+        <w:rPr>
+          <w:rFonts w:ascii="Arial" w:hAnsi="Arial" w:cs="Arial"/>
+          <w:sz w:val="20"/>
+          <w:szCs w:val="20"/>
+        </w:rPr>
+        <w:t xml:space="preserve"> ,</w:t>
+      </w:r>
+      <w:proofErr w:type="spellStart"/>
+      <w:r>
+        <w:rPr>
+          <w:rFonts w:ascii="Arial" w:hAnsi="Arial" w:cs="Arial"/>
+          <w:sz w:val="20"/>
+          <w:szCs w:val="20"/>
+        </w:rPr>
+        <w:t>p_Y</w:t>
+      </w:r>
+      <w:proofErr w:type="spellEnd"/>
+      <w:r>
+        <w:rPr>
+          <w:rFonts w:ascii="Arial" w:hAnsi="Arial" w:cs="Arial"/>
+          <w:sz w:val="20"/>
+          <w:szCs w:val="20"/>
+        </w:rPr>
+        <w:t xml:space="preserve">), que sitúa el objeto en coordenadas </w:t>
       </w:r>
       <w:r>
         <w:rPr>
@@ -719,8 +960,27 @@
           <w:sz w:val="20"/>
           <w:szCs w:val="20"/>
         </w:rPr>
-        <w:t xml:space="preserve"> con el ejecutable: los objetos no trabajan de forma aislada, sino que colaboran mediante el </w:t>
-      </w:r>
+        <w:t xml:space="preserve"> con el ejecutable: los objetos no trabajan de forma aislada, sino que colaboran mediante </w:t>
+      </w:r>
+      <w:proofErr w:type="spellStart"/>
+      <w:r>
+        <w:rPr>
+          <w:rFonts w:ascii="Arial" w:hAnsi="Arial" w:cs="Arial"/>
+          <w:sz w:val="20"/>
+          <w:szCs w:val="20"/>
+        </w:rPr>
+        <w:t>el</w:t>
+      </w:r>
+      <w:proofErr w:type="spellEnd"/>
+      <w:r>
+        <w:rPr>
+          <w:rFonts w:ascii="Arial" w:hAnsi="Arial" w:cs="Arial"/>
+          <w:sz w:val="20"/>
+          <w:szCs w:val="20"/>
+        </w:rPr>
+        <w:t xml:space="preserve"> </w:t>
+      </w:r>
+      <w:proofErr w:type="spellStart"/>
       <w:r>
         <w:rPr>
           <w:rFonts w:ascii="Arial" w:hAnsi="Arial" w:cs="Arial"/>
@@ -729,13 +989,50 @@
         </w:rPr>
         <w:t>envió</w:t>
       </w:r>
-      <w:r>
-        <w:rPr>
-          <w:rFonts w:ascii="Arial" w:hAnsi="Arial" w:cs="Arial"/>
-          <w:sz w:val="20"/>
-          <w:szCs w:val="20"/>
-        </w:rPr>
-        <w:t xml:space="preserve"> de mensajes. En las clases ejecutables (main) , se instancian los objetos invocando sus métodos públicos (como mostrar() , desplazar(), o sueldoNeto()) respetando la interfaz publica de cada entidad.</w:t>
+      <w:proofErr w:type="spellEnd"/>
+      <w:r>
+        <w:rPr>
+          <w:rFonts w:ascii="Arial" w:hAnsi="Arial" w:cs="Arial"/>
+          <w:sz w:val="20"/>
+          <w:szCs w:val="20"/>
+        </w:rPr>
+        <w:t xml:space="preserve"> de mensajes. En las clases ejecutables (</w:t>
+      </w:r>
+      <w:proofErr w:type="spellStart"/>
+      <w:r>
+        <w:rPr>
+          <w:rFonts w:ascii="Arial" w:hAnsi="Arial" w:cs="Arial"/>
+          <w:sz w:val="20"/>
+          <w:szCs w:val="20"/>
+        </w:rPr>
+        <w:t>main</w:t>
+      </w:r>
+      <w:proofErr w:type="spellEnd"/>
+      <w:r>
+        <w:rPr>
+          <w:rFonts w:ascii="Arial" w:hAnsi="Arial" w:cs="Arial"/>
+          <w:sz w:val="20"/>
+          <w:szCs w:val="20"/>
+        </w:rPr>
+        <w:t xml:space="preserve">) , se instancian los objetos invocando sus métodos públicos (como mostrar() , desplazar(), o </w:t>
+      </w:r>
+      <w:proofErr w:type="spellStart"/>
+      <w:r>
+        <w:rPr>
+          <w:rFonts w:ascii="Arial" w:hAnsi="Arial" w:cs="Arial"/>
+          <w:sz w:val="20"/>
+          <w:szCs w:val="20"/>
+        </w:rPr>
+        <w:t>sueldoNeto</w:t>
+      </w:r>
+      <w:proofErr w:type="spellEnd"/>
+      <w:r>
+        <w:rPr>
+          <w:rFonts w:ascii="Arial" w:hAnsi="Arial" w:cs="Arial"/>
+          <w:sz w:val="20"/>
+          <w:szCs w:val="20"/>
+        </w:rPr>
+        <w:t>()) respetando la interfaz publica de cada entidad.</w:t>
       </w:r>
     </w:p>
     <w:p>
@@ -824,7 +1121,25 @@
           <w:sz w:val="20"/>
           <w:szCs w:val="20"/>
         </w:rPr>
-        <w:t>parámetros por argumentos del main.</w:t>
+        <w:t xml:space="preserve">parámetros por argumentos del </w:t>
+      </w:r>
+      <w:proofErr w:type="spellStart"/>
+      <w:r>
+        <w:rPr>
+          <w:rFonts w:ascii="Arial" w:hAnsi="Arial" w:cs="Arial"/>
+          <w:sz w:val="20"/>
+          <w:szCs w:val="20"/>
+        </w:rPr>
+        <w:t>main</w:t>
+      </w:r>
+      <w:proofErr w:type="spellEnd"/>
+      <w:r>
+        <w:rPr>
+          <w:rFonts w:ascii="Arial" w:hAnsi="Arial" w:cs="Arial"/>
+          <w:sz w:val="20"/>
+          <w:szCs w:val="20"/>
+        </w:rPr>
+        <w:t>.</w:t>
       </w:r>
     </w:p>
     <w:p>
@@ -890,13 +1205,23 @@
           <w:szCs w:val="20"/>
         </w:rPr>
       </w:pPr>
-      <w:r>
-        <w:rPr>
-          <w:rFonts w:ascii="Arial" w:hAnsi="Arial" w:cs="Arial"/>
-          <w:sz w:val="20"/>
-          <w:szCs w:val="20"/>
-        </w:rPr>
-        <w:t>Parametros pedidos por teclado .</w:t>
+      <w:proofErr w:type="spellStart"/>
+      <w:r>
+        <w:rPr>
+          <w:rFonts w:ascii="Arial" w:hAnsi="Arial" w:cs="Arial"/>
+          <w:sz w:val="20"/>
+          <w:szCs w:val="20"/>
+        </w:rPr>
+        <w:t>Parametros</w:t>
+      </w:r>
+      <w:proofErr w:type="spellEnd"/>
+      <w:r>
+        <w:rPr>
+          <w:rFonts w:ascii="Arial" w:hAnsi="Arial" w:cs="Arial"/>
+          <w:sz w:val="20"/>
+          <w:szCs w:val="20"/>
+        </w:rPr>
+        <w:t xml:space="preserve"> pedidos por teclado .</w:t>
       </w:r>
     </w:p>
     <w:p>
@@ -2157,6 +2482,17 @@
       <w:spacing w:val="5"/>
     </w:rPr>
   </w:style>
+  <w:style w:type="paragraph" w:styleId="NormalWeb">
+    <w:name w:val="Normal (Web)"/>
+    <w:basedOn w:val="Normal"/>
+    <w:uiPriority w:val="99"/>
+    <w:semiHidden/>
+    <w:unhideWhenUsed/>
+    <w:rsid w:val="001A594B"/>
+    <w:rPr>
+      <w:rFonts w:ascii="Times New Roman" w:hAnsi="Times New Roman" w:cs="Times New Roman"/>
+    </w:rPr>
+  </w:style>
 </w:styles>
 </file>
 

</xml_diff>

<commit_message>
actualice ejercicios de po para entrega de tp4
</commit_message>
<xml_diff>
--- a/POO/practica/tp1bluej/informe tp2.docx
+++ b/POO/practica/tp1bluej/informe tp2.docx
@@ -41,6 +41,7 @@
         <w:t xml:space="preserve">Nombre </w:t>
       </w:r>
       <w:proofErr w:type="spellStart"/>
+      <w:proofErr w:type="gramStart"/>
       <w:r>
         <w:rPr>
           <w:rFonts w:ascii="Arial" w:hAnsi="Arial" w:cs="Arial"/>
@@ -60,6 +61,7 @@
         <w:t>Yanina</w:t>
       </w:r>
       <w:proofErr w:type="spellEnd"/>
+      <w:proofErr w:type="gramEnd"/>
       <w:r>
         <w:rPr>
           <w:rFonts w:ascii="Arial" w:hAnsi="Arial" w:cs="Arial"/>
@@ -488,7 +490,25 @@
           <w:sz w:val="20"/>
           <w:szCs w:val="20"/>
         </w:rPr>
-        <w:t xml:space="preserve"> una  colección (o contenedor) de tipo </w:t>
+        <w:t xml:space="preserve"> </w:t>
+      </w:r>
+      <w:proofErr w:type="gramStart"/>
+      <w:r>
+        <w:rPr>
+          <w:rFonts w:ascii="Arial" w:hAnsi="Arial" w:cs="Arial"/>
+          <w:sz w:val="20"/>
+          <w:szCs w:val="20"/>
+        </w:rPr>
+        <w:t>una  colección</w:t>
+      </w:r>
+      <w:proofErr w:type="gramEnd"/>
+      <w:r>
+        <w:rPr>
+          <w:rFonts w:ascii="Arial" w:hAnsi="Arial" w:cs="Arial"/>
+          <w:sz w:val="20"/>
+          <w:szCs w:val="20"/>
+        </w:rPr>
+        <w:t xml:space="preserve"> (o contenedor) de tipo </w:t>
       </w:r>
       <w:proofErr w:type="spellStart"/>
       <w:r>
@@ -666,40 +686,276 @@
         <w:spacing w:after="0" w:line="240" w:lineRule="auto"/>
         <w:rPr>
           <w:rFonts w:ascii="Arial" w:hAnsi="Arial" w:cs="Arial"/>
-          <w:sz w:val="20"/>
-          <w:szCs w:val="20"/>
-        </w:rPr>
-      </w:pPr>
-      <w:r>
-        <w:rPr>
-          <w:rFonts w:ascii="Arial" w:hAnsi="Arial" w:cs="Arial"/>
-          <w:sz w:val="20"/>
-          <w:szCs w:val="20"/>
-        </w:rPr>
-        <w:t>.</w:t>
-      </w:r>
-    </w:p>
-    <w:p>
-      <w:pPr>
-        <w:spacing w:after="0" w:line="240" w:lineRule="auto"/>
-        <w:rPr>
-          <w:rFonts w:ascii="Arial" w:hAnsi="Arial" w:cs="Arial"/>
-          <w:sz w:val="20"/>
-          <w:szCs w:val="20"/>
-        </w:rPr>
-      </w:pPr>
-      <w:r>
-        <w:rPr>
-          <w:rFonts w:ascii="Arial" w:hAnsi="Arial" w:cs="Arial"/>
+          <w:b/>
+          <w:bCs/>
+          <w:sz w:val="20"/>
+          <w:szCs w:val="20"/>
+        </w:rPr>
+      </w:pPr>
+      <w:r>
+        <w:rPr>
+          <w:rFonts w:ascii="Arial" w:hAnsi="Arial" w:cs="Arial"/>
+          <w:b/>
+          <w:bCs/>
+          <w:sz w:val="20"/>
+          <w:szCs w:val="20"/>
+        </w:rPr>
+        <w:t>Implementación de una Lista Homogénea Dinámica (</w:t>
+      </w:r>
+      <w:proofErr w:type="spellStart"/>
+      <w:r>
+        <w:rPr>
+          <w:rFonts w:ascii="Arial" w:hAnsi="Arial" w:cs="Arial"/>
+          <w:b/>
+          <w:bCs/>
+          <w:sz w:val="20"/>
+          <w:szCs w:val="20"/>
+        </w:rPr>
+        <w:t>ArrayList</w:t>
+      </w:r>
+      <w:proofErr w:type="spellEnd"/>
+      <w:r>
+        <w:rPr>
+          <w:rFonts w:ascii="Arial" w:hAnsi="Arial" w:cs="Arial"/>
+          <w:b/>
+          <w:bCs/>
+          <w:sz w:val="20"/>
+          <w:szCs w:val="20"/>
+        </w:rPr>
+        <w:t>)</w:t>
+      </w:r>
+    </w:p>
+    <w:p>
+      <w:pPr>
+        <w:spacing w:after="0" w:line="240" w:lineRule="auto"/>
+        <w:rPr>
+          <w:rFonts w:ascii="Arial" w:hAnsi="Arial" w:cs="Arial"/>
+          <w:sz w:val="20"/>
+          <w:szCs w:val="20"/>
+        </w:rPr>
+      </w:pPr>
+      <w:r>
+        <w:rPr>
+          <w:rFonts w:ascii="Arial" w:hAnsi="Arial" w:cs="Arial"/>
+          <w:sz w:val="20"/>
+          <w:szCs w:val="20"/>
+        </w:rPr>
+        <w:t xml:space="preserve">En Java, un </w:t>
+      </w:r>
+      <w:proofErr w:type="spellStart"/>
+      <w:r>
+        <w:rPr>
+          <w:rFonts w:ascii="Arial" w:hAnsi="Arial" w:cs="Arial"/>
+          <w:b/>
+          <w:bCs/>
+          <w:sz w:val="20"/>
+          <w:szCs w:val="20"/>
+        </w:rPr>
+        <w:t>ArrayList</w:t>
+      </w:r>
+      <w:proofErr w:type="spellEnd"/>
+      <w:r>
+        <w:rPr>
+          <w:rFonts w:ascii="Arial" w:hAnsi="Arial" w:cs="Arial"/>
+          <w:sz w:val="20"/>
+          <w:szCs w:val="20"/>
+        </w:rPr>
+        <w:t xml:space="preserve"> representa una colección </w:t>
+      </w:r>
+      <w:r>
+        <w:rPr>
+          <w:rFonts w:ascii="Arial" w:hAnsi="Arial" w:cs="Arial"/>
+          <w:b/>
+          <w:bCs/>
+          <w:sz w:val="20"/>
+          <w:szCs w:val="20"/>
+        </w:rPr>
+        <w:t>dinámica y homogénea</w:t>
+      </w:r>
+      <w:r>
+        <w:rPr>
+          <w:rFonts w:ascii="Arial" w:hAnsi="Arial" w:cs="Arial"/>
+          <w:sz w:val="20"/>
+          <w:szCs w:val="20"/>
+        </w:rPr>
+        <w:t>:</w:t>
+      </w:r>
+    </w:p>
+    <w:p>
+      <w:pPr>
+        <w:numPr>
+          <w:ilvl w:val="0"/>
+          <w:numId w:val="2"/>
+        </w:numPr>
+        <w:spacing w:after="0" w:line="240" w:lineRule="auto"/>
+        <w:rPr>
+          <w:rFonts w:ascii="Arial" w:hAnsi="Arial" w:cs="Arial"/>
+          <w:sz w:val="20"/>
+          <w:szCs w:val="20"/>
+        </w:rPr>
+      </w:pPr>
+      <w:r>
+        <w:rPr>
+          <w:rFonts w:ascii="Arial" w:hAnsi="Arial" w:cs="Arial"/>
+          <w:b/>
+          <w:bCs/>
+          <w:sz w:val="20"/>
+          <w:szCs w:val="20"/>
+        </w:rPr>
+        <w:t>Dinámica:</w:t>
+      </w:r>
+      <w:r>
+        <w:rPr>
+          <w:rFonts w:ascii="Arial" w:hAnsi="Arial" w:cs="Arial"/>
+          <w:sz w:val="20"/>
+          <w:szCs w:val="20"/>
+        </w:rPr>
+        <w:t xml:space="preserve"> A diferencia de un arreglo convencional (como </w:t>
+      </w:r>
+      <w:proofErr w:type="gramStart"/>
+      <w:r>
+        <w:rPr>
+          <w:rFonts w:ascii="Arial" w:hAnsi="Arial" w:cs="Arial"/>
+          <w:sz w:val="20"/>
+          <w:szCs w:val="20"/>
+        </w:rPr>
+        <w:t>Punto[</w:t>
+      </w:r>
+      <w:proofErr w:type="gramEnd"/>
+      <w:r>
+        <w:rPr>
+          <w:rFonts w:ascii="Arial" w:hAnsi="Arial" w:cs="Arial"/>
+          <w:sz w:val="20"/>
+          <w:szCs w:val="20"/>
+        </w:rPr>
+        <w:t xml:space="preserve">]), su tamaño no es fijo. Puede crecer o reducirse en tiempo de ejecución a medida que se agregan o quitan elementos mediante métodos </w:t>
+      </w:r>
+      <w:proofErr w:type="gramStart"/>
+      <w:r>
+        <w:rPr>
+          <w:rFonts w:ascii="Arial" w:hAnsi="Arial" w:cs="Arial"/>
+          <w:sz w:val="20"/>
+          <w:szCs w:val="20"/>
+        </w:rPr>
+        <w:t>como .</w:t>
+      </w:r>
+      <w:proofErr w:type="spellStart"/>
+      <w:r>
+        <w:rPr>
+          <w:rFonts w:ascii="Arial" w:hAnsi="Arial" w:cs="Arial"/>
+          <w:sz w:val="20"/>
+          <w:szCs w:val="20"/>
+        </w:rPr>
+        <w:t>add</w:t>
+      </w:r>
+      <w:proofErr w:type="spellEnd"/>
+      <w:proofErr w:type="gramEnd"/>
+      <w:r>
+        <w:rPr>
+          <w:rFonts w:ascii="Arial" w:hAnsi="Arial" w:cs="Arial"/>
+          <w:sz w:val="20"/>
+          <w:szCs w:val="20"/>
+        </w:rPr>
+        <w:t xml:space="preserve">() </w:t>
+      </w:r>
+      <w:proofErr w:type="gramStart"/>
+      <w:r>
+        <w:rPr>
+          <w:rFonts w:ascii="Arial" w:hAnsi="Arial" w:cs="Arial"/>
+          <w:sz w:val="20"/>
+          <w:szCs w:val="20"/>
+        </w:rPr>
+        <w:t>y .</w:t>
+      </w:r>
+      <w:proofErr w:type="spellStart"/>
+      <w:r>
+        <w:rPr>
+          <w:rFonts w:ascii="Arial" w:hAnsi="Arial" w:cs="Arial"/>
+          <w:sz w:val="20"/>
+          <w:szCs w:val="20"/>
+        </w:rPr>
+        <w:t>remove</w:t>
+      </w:r>
+      <w:proofErr w:type="spellEnd"/>
+      <w:proofErr w:type="gramEnd"/>
+      <w:r>
+        <w:rPr>
+          <w:rFonts w:ascii="Arial" w:hAnsi="Arial" w:cs="Arial"/>
+          <w:sz w:val="20"/>
+          <w:szCs w:val="20"/>
+        </w:rPr>
+        <w:t>().</w:t>
+      </w:r>
+    </w:p>
+    <w:p>
+      <w:pPr>
+        <w:numPr>
+          <w:ilvl w:val="0"/>
+          <w:numId w:val="2"/>
+        </w:numPr>
+        <w:spacing w:after="0" w:line="240" w:lineRule="auto"/>
+        <w:rPr>
+          <w:rFonts w:ascii="Arial" w:hAnsi="Arial" w:cs="Arial"/>
+          <w:sz w:val="20"/>
+          <w:szCs w:val="20"/>
+        </w:rPr>
+      </w:pPr>
+      <w:r>
+        <w:rPr>
+          <w:rFonts w:ascii="Arial" w:hAnsi="Arial" w:cs="Arial"/>
+          <w:b/>
+          <w:bCs/>
+          <w:sz w:val="20"/>
+          <w:szCs w:val="20"/>
+        </w:rPr>
+        <w:t>Homogénea:</w:t>
+      </w:r>
+      <w:r>
+        <w:rPr>
+          <w:rFonts w:ascii="Arial" w:hAnsi="Arial" w:cs="Arial"/>
+          <w:sz w:val="20"/>
+          <w:szCs w:val="20"/>
+        </w:rPr>
+        <w:t xml:space="preserve"> Aunque internamente gestiona los elementos como </w:t>
+      </w:r>
+      <w:proofErr w:type="spellStart"/>
+      <w:r>
+        <w:rPr>
+          <w:rFonts w:ascii="Arial" w:hAnsi="Arial" w:cs="Arial"/>
+          <w:sz w:val="20"/>
+          <w:szCs w:val="20"/>
+        </w:rPr>
+        <w:t>Object</w:t>
+      </w:r>
+      <w:proofErr w:type="spellEnd"/>
+      <w:r>
+        <w:rPr>
+          <w:rFonts w:ascii="Arial" w:hAnsi="Arial" w:cs="Arial"/>
+          <w:sz w:val="20"/>
+          <w:szCs w:val="20"/>
+        </w:rPr>
+        <w:t>, está concebida para almacenar objetos de un mismo tipo conceptual (en este caso, objetos de la clase Producto).</w:t>
+      </w:r>
+    </w:p>
+    <w:p>
+      <w:pPr>
+        <w:spacing w:after="0" w:line="240" w:lineRule="auto"/>
+        <w:ind w:left="720"/>
+        <w:rPr>
+          <w:rFonts w:ascii="Arial" w:hAnsi="Arial" w:cs="Arial"/>
+          <w:sz w:val="20"/>
+          <w:szCs w:val="20"/>
+        </w:rPr>
+      </w:pPr>
+      <w:r>
+        <w:rPr>
           <w:noProof/>
-          <w:sz w:val="20"/>
-          <w:szCs w:val="20"/>
         </w:rPr>
         <w:drawing>
-          <wp:inline distT="0" distB="0" distL="0" distR="0" wp14:anchorId="4526914F" wp14:editId="4F693DF3">
-            <wp:extent cx="5400040" cy="583565"/>
-            <wp:effectExtent l="0" t="0" r="0" b="6985"/>
-            <wp:docPr id="1065206157" name="Imagen 1"/>
+          <wp:inline distT="0" distB="0" distL="0" distR="0" wp14:anchorId="79C97112" wp14:editId="4003BFBE">
+            <wp:extent cx="2638425" cy="428625"/>
+            <wp:effectExtent l="0" t="0" r="9525" b="9525"/>
+            <wp:docPr id="1011737820" name="Imagen 1"/>
             <wp:cNvGraphicFramePr>
               <a:graphicFrameLocks xmlns:a="http://schemas.openxmlformats.org/drawingml/2006/main" noChangeAspect="1"/>
             </wp:cNvGraphicFramePr>
@@ -707,7 +963,7 @@
               <a:graphicData uri="http://schemas.openxmlformats.org/drawingml/2006/picture">
                 <pic:pic xmlns:pic="http://schemas.openxmlformats.org/drawingml/2006/picture">
                   <pic:nvPicPr>
-                    <pic:cNvPr id="1065206157" name=""/>
+                    <pic:cNvPr id="1011737820" name=""/>
                     <pic:cNvPicPr/>
                   </pic:nvPicPr>
                   <pic:blipFill>
@@ -719,7 +975,7 @@
                   <pic:spPr>
                     <a:xfrm>
                       <a:off x="0" y="0"/>
-                      <a:ext cx="5400040" cy="583565"/>
+                      <a:ext cx="2638425" cy="428625"/>
                     </a:xfrm>
                     <a:prstGeom prst="rect">
                       <a:avLst/>
@@ -735,6 +991,105 @@
     <w:p>
       <w:pPr>
         <w:spacing w:after="0" w:line="240" w:lineRule="auto"/>
+        <w:ind w:left="720"/>
+        <w:rPr>
+          <w:rFonts w:ascii="Arial" w:hAnsi="Arial" w:cs="Arial"/>
+          <w:sz w:val="20"/>
+          <w:szCs w:val="20"/>
+        </w:rPr>
+      </w:pPr>
+    </w:p>
+    <w:p>
+      <w:pPr>
+        <w:spacing w:after="0" w:line="240" w:lineRule="auto"/>
+        <w:ind w:left="720"/>
+        <w:rPr>
+          <w:rFonts w:ascii="Arial" w:hAnsi="Arial" w:cs="Arial"/>
+          <w:sz w:val="20"/>
+          <w:szCs w:val="20"/>
+        </w:rPr>
+      </w:pPr>
+      <w:r>
+        <w:rPr>
+          <w:rFonts w:ascii="Arial" w:hAnsi="Arial" w:cs="Arial"/>
+          <w:sz w:val="20"/>
+          <w:szCs w:val="20"/>
+        </w:rPr>
+        <w:t xml:space="preserve">Métodos para manipular el array </w:t>
+      </w:r>
+      <w:proofErr w:type="spellStart"/>
+      <w:r>
+        <w:rPr>
+          <w:rFonts w:ascii="Arial" w:hAnsi="Arial" w:cs="Arial"/>
+          <w:sz w:val="20"/>
+          <w:szCs w:val="20"/>
+        </w:rPr>
+        <w:t>list</w:t>
+      </w:r>
+      <w:proofErr w:type="spellEnd"/>
+      <w:r>
+        <w:rPr>
+          <w:rFonts w:ascii="Arial" w:hAnsi="Arial" w:cs="Arial"/>
+          <w:sz w:val="20"/>
+          <w:szCs w:val="20"/>
+        </w:rPr>
+        <w:t>:</w:t>
+      </w:r>
+    </w:p>
+    <w:p>
+      <w:pPr>
+        <w:spacing w:after="0" w:line="240" w:lineRule="auto"/>
+        <w:ind w:left="720"/>
+        <w:rPr>
+          <w:rFonts w:ascii="Arial" w:hAnsi="Arial" w:cs="Arial"/>
+          <w:sz w:val="20"/>
+          <w:szCs w:val="20"/>
+        </w:rPr>
+      </w:pPr>
+      <w:r>
+        <w:rPr>
+          <w:noProof/>
+        </w:rPr>
+        <w:drawing>
+          <wp:inline distT="0" distB="0" distL="0" distR="0" wp14:anchorId="503E0631" wp14:editId="768058BE">
+            <wp:extent cx="4629150" cy="1647825"/>
+            <wp:effectExtent l="0" t="0" r="0" b="9525"/>
+            <wp:docPr id="664305429" name="Imagen 1"/>
+            <wp:cNvGraphicFramePr>
+              <a:graphicFrameLocks xmlns:a="http://schemas.openxmlformats.org/drawingml/2006/main" noChangeAspect="1"/>
+            </wp:cNvGraphicFramePr>
+            <a:graphic xmlns:a="http://schemas.openxmlformats.org/drawingml/2006/main">
+              <a:graphicData uri="http://schemas.openxmlformats.org/drawingml/2006/picture">
+                <pic:pic xmlns:pic="http://schemas.openxmlformats.org/drawingml/2006/picture">
+                  <pic:nvPicPr>
+                    <pic:cNvPr id="664305429" name=""/>
+                    <pic:cNvPicPr/>
+                  </pic:nvPicPr>
+                  <pic:blipFill>
+                    <a:blip r:embed="rId7"/>
+                    <a:stretch>
+                      <a:fillRect/>
+                    </a:stretch>
+                  </pic:blipFill>
+                  <pic:spPr>
+                    <a:xfrm>
+                      <a:off x="0" y="0"/>
+                      <a:ext cx="4629150" cy="1647825"/>
+                    </a:xfrm>
+                    <a:prstGeom prst="rect">
+                      <a:avLst/>
+                    </a:prstGeom>
+                  </pic:spPr>
+                </pic:pic>
+              </a:graphicData>
+            </a:graphic>
+          </wp:inline>
+        </w:drawing>
+      </w:r>
+    </w:p>
+    <w:p>
+      <w:pPr>
+        <w:spacing w:after="0" w:line="240" w:lineRule="auto"/>
         <w:rPr>
           <w:rFonts w:ascii="Arial" w:hAnsi="Arial" w:cs="Arial"/>
           <w:sz w:val="20"/>
@@ -748,108 +1103,17 @@
           <w:szCs w:val="20"/>
         </w:rPr>
         <w:tab/>
-        <w:t xml:space="preserve">-Sobrecarga de Constructores : la </w:t>
-      </w:r>
-      <w:r>
-        <w:rPr>
-          <w:rFonts w:ascii="Arial" w:hAnsi="Arial" w:cs="Arial"/>
-          <w:sz w:val="20"/>
-          <w:szCs w:val="20"/>
-        </w:rPr>
-        <w:t>sobrecarga</w:t>
-      </w:r>
-      <w:r>
-        <w:rPr>
-          <w:rFonts w:ascii="Arial" w:hAnsi="Arial" w:cs="Arial"/>
-          <w:sz w:val="20"/>
-          <w:szCs w:val="20"/>
-        </w:rPr>
-        <w:t xml:space="preserve"> permite definir </w:t>
-      </w:r>
-      <w:r>
-        <w:rPr>
-          <w:rFonts w:ascii="Arial" w:hAnsi="Arial" w:cs="Arial"/>
-          <w:sz w:val="20"/>
-          <w:szCs w:val="20"/>
-        </w:rPr>
-        <w:t>múltiples</w:t>
-      </w:r>
-      <w:r>
-        <w:rPr>
-          <w:rFonts w:ascii="Arial" w:hAnsi="Arial" w:cs="Arial"/>
-          <w:sz w:val="20"/>
-          <w:szCs w:val="20"/>
-        </w:rPr>
-        <w:t xml:space="preserve"> constructores para una misma clase, diferenciados por su firma (cantidad o tipo de parámetros). En la clase “Punto”, se implementaron dos constructores: uno por defecto punto (), que inicializa las </w:t>
-      </w:r>
-      <w:r>
-        <w:rPr>
-          <w:rFonts w:ascii="Arial" w:hAnsi="Arial" w:cs="Arial"/>
-          <w:sz w:val="20"/>
-          <w:szCs w:val="20"/>
-        </w:rPr>
-        <w:t>coordenadas</w:t>
-      </w:r>
-      <w:r>
-        <w:rPr>
-          <w:rFonts w:ascii="Arial" w:hAnsi="Arial" w:cs="Arial"/>
-          <w:sz w:val="20"/>
-          <w:szCs w:val="20"/>
-        </w:rPr>
-        <w:t xml:space="preserve"> en el origen(0,0) y el otro explicito punto (</w:t>
-      </w:r>
-      <w:proofErr w:type="spellStart"/>
-      <w:r>
-        <w:rPr>
-          <w:rFonts w:ascii="Arial" w:hAnsi="Arial" w:cs="Arial"/>
-          <w:sz w:val="20"/>
-          <w:szCs w:val="20"/>
-        </w:rPr>
-        <w:t>p_x</w:t>
-      </w:r>
-      <w:proofErr w:type="spellEnd"/>
-      <w:r>
-        <w:rPr>
-          <w:rFonts w:ascii="Arial" w:hAnsi="Arial" w:cs="Arial"/>
-          <w:sz w:val="20"/>
-          <w:szCs w:val="20"/>
-        </w:rPr>
-        <w:t xml:space="preserve"> ,</w:t>
-      </w:r>
-      <w:proofErr w:type="spellStart"/>
-      <w:r>
-        <w:rPr>
-          <w:rFonts w:ascii="Arial" w:hAnsi="Arial" w:cs="Arial"/>
-          <w:sz w:val="20"/>
-          <w:szCs w:val="20"/>
-        </w:rPr>
-        <w:t>p_Y</w:t>
-      </w:r>
-      <w:proofErr w:type="spellEnd"/>
-      <w:r>
-        <w:rPr>
-          <w:rFonts w:ascii="Arial" w:hAnsi="Arial" w:cs="Arial"/>
-          <w:sz w:val="20"/>
-          <w:szCs w:val="20"/>
-        </w:rPr>
-        <w:t xml:space="preserve">), que sitúa el objeto en coordenadas </w:t>
-      </w:r>
-      <w:r>
-        <w:rPr>
-          <w:rFonts w:ascii="Arial" w:hAnsi="Arial" w:cs="Arial"/>
-          <w:sz w:val="20"/>
-          <w:szCs w:val="20"/>
-        </w:rPr>
-        <w:t>específicas</w:t>
-      </w:r>
-      <w:r>
-        <w:rPr>
-          <w:rFonts w:ascii="Arial" w:hAnsi="Arial" w:cs="Arial"/>
-          <w:sz w:val="20"/>
-          <w:szCs w:val="20"/>
-        </w:rPr>
-        <w:t xml:space="preserve"> provistas por el usuario.</w:t>
-      </w:r>
+      </w:r>
+    </w:p>
+    <w:p>
+      <w:pPr>
+        <w:spacing w:after="0" w:line="240" w:lineRule="auto"/>
+        <w:rPr>
+          <w:rFonts w:ascii="Arial" w:hAnsi="Arial" w:cs="Arial"/>
+          <w:sz w:val="20"/>
+          <w:szCs w:val="20"/>
+        </w:rPr>
+      </w:pPr>
     </w:p>
     <w:p>
       <w:pPr>
@@ -867,6 +1131,7 @@
           <w:sz w:val="20"/>
           <w:szCs w:val="20"/>
         </w:rPr>
+        <w:lastRenderedPageBreak/>
         <w:drawing>
           <wp:inline distT="0" distB="0" distL="0" distR="0" wp14:anchorId="0EACD9D3" wp14:editId="2F16AFA1">
             <wp:extent cx="5400040" cy="1343025"/>
@@ -883,7 +1148,7 @@
                     <pic:cNvPicPr/>
                   </pic:nvPicPr>
                   <pic:blipFill>
-                    <a:blip r:embed="rId7"/>
+                    <a:blip r:embed="rId8"/>
                     <a:stretch>
                       <a:fillRect/>
                     </a:stretch>
@@ -1008,15 +1273,62 @@
         <w:t>main</w:t>
       </w:r>
       <w:proofErr w:type="spellEnd"/>
-      <w:r>
-        <w:rPr>
-          <w:rFonts w:ascii="Arial" w:hAnsi="Arial" w:cs="Arial"/>
-          <w:sz w:val="20"/>
-          <w:szCs w:val="20"/>
-        </w:rPr>
-        <w:t xml:space="preserve">) , se instancian los objetos invocando sus métodos públicos (como mostrar() , desplazar(), o </w:t>
+      <w:proofErr w:type="gramStart"/>
+      <w:r>
+        <w:rPr>
+          <w:rFonts w:ascii="Arial" w:hAnsi="Arial" w:cs="Arial"/>
+          <w:sz w:val="20"/>
+          <w:szCs w:val="20"/>
+        </w:rPr>
+        <w:t>) ,</w:t>
+      </w:r>
+      <w:proofErr w:type="gramEnd"/>
+      <w:r>
+        <w:rPr>
+          <w:rFonts w:ascii="Arial" w:hAnsi="Arial" w:cs="Arial"/>
+          <w:sz w:val="20"/>
+          <w:szCs w:val="20"/>
+        </w:rPr>
+        <w:t xml:space="preserve"> se instancian los objetos invocando sus métodos públicos (como </w:t>
+      </w:r>
+      <w:proofErr w:type="gramStart"/>
+      <w:r>
+        <w:rPr>
+          <w:rFonts w:ascii="Arial" w:hAnsi="Arial" w:cs="Arial"/>
+          <w:sz w:val="20"/>
+          <w:szCs w:val="20"/>
+        </w:rPr>
+        <w:t>mostrar() ,</w:t>
+      </w:r>
+      <w:proofErr w:type="gramEnd"/>
+      <w:r>
+        <w:rPr>
+          <w:rFonts w:ascii="Arial" w:hAnsi="Arial" w:cs="Arial"/>
+          <w:sz w:val="20"/>
+          <w:szCs w:val="20"/>
+        </w:rPr>
+        <w:t xml:space="preserve"> </w:t>
+      </w:r>
+      <w:proofErr w:type="gramStart"/>
+      <w:r>
+        <w:rPr>
+          <w:rFonts w:ascii="Arial" w:hAnsi="Arial" w:cs="Arial"/>
+          <w:sz w:val="20"/>
+          <w:szCs w:val="20"/>
+        </w:rPr>
+        <w:t>desplazar(</w:t>
+      </w:r>
+      <w:proofErr w:type="gramEnd"/>
+      <w:r>
+        <w:rPr>
+          <w:rFonts w:ascii="Arial" w:hAnsi="Arial" w:cs="Arial"/>
+          <w:sz w:val="20"/>
+          <w:szCs w:val="20"/>
+        </w:rPr>
+        <w:t xml:space="preserve">), o </w:t>
       </w:r>
       <w:proofErr w:type="spellStart"/>
+      <w:proofErr w:type="gramStart"/>
       <w:r>
         <w:rPr>
           <w:rFonts w:ascii="Arial" w:hAnsi="Arial" w:cs="Arial"/>
@@ -1032,7 +1344,16 @@
           <w:sz w:val="20"/>
           <w:szCs w:val="20"/>
         </w:rPr>
-        <w:t>()) respetando la interfaz publica de cada entidad.</w:t>
+        <w:t>(</w:t>
+      </w:r>
+      <w:proofErr w:type="gramEnd"/>
+      <w:r>
+        <w:rPr>
+          <w:rFonts w:ascii="Arial" w:hAnsi="Arial" w:cs="Arial"/>
+          <w:sz w:val="20"/>
+          <w:szCs w:val="20"/>
+        </w:rPr>
+        <w:t>)) respetando la interfaz publica de cada entidad.</w:t>
       </w:r>
     </w:p>
     <w:p>
@@ -1085,7 +1406,7 @@
                     <pic:cNvPicPr/>
                   </pic:nvPicPr>
                   <pic:blipFill>
-                    <a:blip r:embed="rId8"/>
+                    <a:blip r:embed="rId9"/>
                     <a:stretch>
                       <a:fillRect/>
                     </a:stretch>
@@ -1158,7 +1479,6 @@
           <w:sz w:val="20"/>
           <w:szCs w:val="20"/>
         </w:rPr>
-        <w:lastRenderedPageBreak/>
         <w:drawing>
           <wp:inline distT="0" distB="0" distL="0" distR="0" wp14:anchorId="473BBE43" wp14:editId="24362DEC">
             <wp:extent cx="5400040" cy="2432685"/>
@@ -1175,7 +1495,7 @@
                     <pic:cNvPicPr/>
                   </pic:nvPicPr>
                   <pic:blipFill>
-                    <a:blip r:embed="rId9"/>
+                    <a:blip r:embed="rId10"/>
                     <a:stretch>
                       <a:fillRect/>
                     </a:stretch>
@@ -1221,8 +1541,18 @@
           <w:sz w:val="20"/>
           <w:szCs w:val="20"/>
         </w:rPr>
-        <w:t xml:space="preserve"> pedidos por teclado .</w:t>
-      </w:r>
+        <w:t xml:space="preserve"> pedidos por </w:t>
+      </w:r>
+      <w:proofErr w:type="gramStart"/>
+      <w:r>
+        <w:rPr>
+          <w:rFonts w:ascii="Arial" w:hAnsi="Arial" w:cs="Arial"/>
+          <w:sz w:val="20"/>
+          <w:szCs w:val="20"/>
+        </w:rPr>
+        <w:t>teclado .</w:t>
+      </w:r>
+      <w:proofErr w:type="gramEnd"/>
     </w:p>
     <w:p>
       <w:pPr>
@@ -1256,7 +1586,7 @@
                     <pic:cNvPicPr/>
                   </pic:nvPicPr>
                   <pic:blipFill>
-                    <a:blip r:embed="rId10"/>
+                    <a:blip r:embed="rId11"/>
                     <a:stretch>
                       <a:fillRect/>
                     </a:stretch>
@@ -1560,8 +1890,160 @@
       </w:rPr>
     </w:lvl>
   </w:abstractNum>
+  <w:abstractNum w:abstractNumId="1" w15:restartNumberingAfterBreak="0">
+    <w:nsid w:val="750041A2"/>
+    <w:multiLevelType w:val="multilevel"/>
+    <w:tmpl w:val="63FE8B1E"/>
+    <w:lvl w:ilvl="0">
+      <w:start w:val="1"/>
+      <w:numFmt w:val="bullet"/>
+      <w:lvlText w:val=""/>
+      <w:lvlJc w:val="left"/>
+      <w:pPr>
+        <w:tabs>
+          <w:tab w:val="num" w:pos="720"/>
+        </w:tabs>
+        <w:ind w:left="720" w:hanging="360"/>
+      </w:pPr>
+      <w:rPr>
+        <w:rFonts w:ascii="Symbol" w:hAnsi="Symbol" w:hint="default"/>
+        <w:sz w:val="20"/>
+      </w:rPr>
+    </w:lvl>
+    <w:lvl w:ilvl="1" w:tentative="1">
+      <w:start w:val="1"/>
+      <w:numFmt w:val="bullet"/>
+      <w:lvlText w:val="o"/>
+      <w:lvlJc w:val="left"/>
+      <w:pPr>
+        <w:tabs>
+          <w:tab w:val="num" w:pos="1440"/>
+        </w:tabs>
+        <w:ind w:left="1440" w:hanging="360"/>
+      </w:pPr>
+      <w:rPr>
+        <w:rFonts w:ascii="Courier New" w:hAnsi="Courier New" w:hint="default"/>
+        <w:sz w:val="20"/>
+      </w:rPr>
+    </w:lvl>
+    <w:lvl w:ilvl="2" w:tentative="1">
+      <w:start w:val="1"/>
+      <w:numFmt w:val="bullet"/>
+      <w:lvlText w:val=""/>
+      <w:lvlJc w:val="left"/>
+      <w:pPr>
+        <w:tabs>
+          <w:tab w:val="num" w:pos="2160"/>
+        </w:tabs>
+        <w:ind w:left="2160" w:hanging="360"/>
+      </w:pPr>
+      <w:rPr>
+        <w:rFonts w:ascii="Wingdings" w:hAnsi="Wingdings" w:hint="default"/>
+        <w:sz w:val="20"/>
+      </w:rPr>
+    </w:lvl>
+    <w:lvl w:ilvl="3" w:tentative="1">
+      <w:start w:val="1"/>
+      <w:numFmt w:val="bullet"/>
+      <w:lvlText w:val=""/>
+      <w:lvlJc w:val="left"/>
+      <w:pPr>
+        <w:tabs>
+          <w:tab w:val="num" w:pos="2880"/>
+        </w:tabs>
+        <w:ind w:left="2880" w:hanging="360"/>
+      </w:pPr>
+      <w:rPr>
+        <w:rFonts w:ascii="Wingdings" w:hAnsi="Wingdings" w:hint="default"/>
+        <w:sz w:val="20"/>
+      </w:rPr>
+    </w:lvl>
+    <w:lvl w:ilvl="4" w:tentative="1">
+      <w:start w:val="1"/>
+      <w:numFmt w:val="bullet"/>
+      <w:lvlText w:val=""/>
+      <w:lvlJc w:val="left"/>
+      <w:pPr>
+        <w:tabs>
+          <w:tab w:val="num" w:pos="3600"/>
+        </w:tabs>
+        <w:ind w:left="3600" w:hanging="360"/>
+      </w:pPr>
+      <w:rPr>
+        <w:rFonts w:ascii="Wingdings" w:hAnsi="Wingdings" w:hint="default"/>
+        <w:sz w:val="20"/>
+      </w:rPr>
+    </w:lvl>
+    <w:lvl w:ilvl="5" w:tentative="1">
+      <w:start w:val="1"/>
+      <w:numFmt w:val="bullet"/>
+      <w:lvlText w:val=""/>
+      <w:lvlJc w:val="left"/>
+      <w:pPr>
+        <w:tabs>
+          <w:tab w:val="num" w:pos="4320"/>
+        </w:tabs>
+        <w:ind w:left="4320" w:hanging="360"/>
+      </w:pPr>
+      <w:rPr>
+        <w:rFonts w:ascii="Wingdings" w:hAnsi="Wingdings" w:hint="default"/>
+        <w:sz w:val="20"/>
+      </w:rPr>
+    </w:lvl>
+    <w:lvl w:ilvl="6" w:tentative="1">
+      <w:start w:val="1"/>
+      <w:numFmt w:val="bullet"/>
+      <w:lvlText w:val=""/>
+      <w:lvlJc w:val="left"/>
+      <w:pPr>
+        <w:tabs>
+          <w:tab w:val="num" w:pos="5040"/>
+        </w:tabs>
+        <w:ind w:left="5040" w:hanging="360"/>
+      </w:pPr>
+      <w:rPr>
+        <w:rFonts w:ascii="Wingdings" w:hAnsi="Wingdings" w:hint="default"/>
+        <w:sz w:val="20"/>
+      </w:rPr>
+    </w:lvl>
+    <w:lvl w:ilvl="7" w:tentative="1">
+      <w:start w:val="1"/>
+      <w:numFmt w:val="bullet"/>
+      <w:lvlText w:val=""/>
+      <w:lvlJc w:val="left"/>
+      <w:pPr>
+        <w:tabs>
+          <w:tab w:val="num" w:pos="5760"/>
+        </w:tabs>
+        <w:ind w:left="5760" w:hanging="360"/>
+      </w:pPr>
+      <w:rPr>
+        <w:rFonts w:ascii="Wingdings" w:hAnsi="Wingdings" w:hint="default"/>
+        <w:sz w:val="20"/>
+      </w:rPr>
+    </w:lvl>
+    <w:lvl w:ilvl="8" w:tentative="1">
+      <w:start w:val="1"/>
+      <w:numFmt w:val="bullet"/>
+      <w:lvlText w:val=""/>
+      <w:lvlJc w:val="left"/>
+      <w:pPr>
+        <w:tabs>
+          <w:tab w:val="num" w:pos="6480"/>
+        </w:tabs>
+        <w:ind w:left="6480" w:hanging="360"/>
+      </w:pPr>
+      <w:rPr>
+        <w:rFonts w:ascii="Wingdings" w:hAnsi="Wingdings" w:hint="default"/>
+        <w:sz w:val="20"/>
+      </w:rPr>
+    </w:lvl>
+  </w:abstractNum>
   <w:num w:numId="1" w16cid:durableId="857238078">
     <w:abstractNumId w:val="0"/>
+  </w:num>
+  <w:num w:numId="2" w16cid:durableId="980118430">
+    <w:abstractNumId w:val="1"/>
   </w:num>
 </w:numbering>
 </file>

</xml_diff>